<commit_message>
adding character form and css not fully done but is looking good so far
</commit_message>
<xml_diff>
--- a/L3 Web Application Development Log.docx
+++ b/L3 Web Application Development Log.docx
@@ -756,8 +756,8 @@
               </w:rPr>
             </w:pPr>
             <w:r>
-              <w:object w:dxaOrig="8747" w:dyaOrig="5223">
-                <v:rect xmlns:o="urn:schemas-microsoft-com:office:office" xmlns:v="urn:schemas-microsoft-com:vml" id="rectole0000000000" style="width:437.350000pt;height:261.150000pt" o:preferrelative="t" o:ole="">
+              <w:object w:dxaOrig="8949" w:dyaOrig="5345">
+                <v:rect xmlns:o="urn:schemas-microsoft-com:office:office" xmlns:v="urn:schemas-microsoft-com:vml" id="rectole0000000000" style="width:447.450000pt;height:267.250000pt" o:preferrelative="t" o:ole="">
                   <o:lock v:ext="edit"/>
                   <v:imagedata xmlns:r="http://schemas.openxmlformats.org/officeDocument/2006/relationships" r:id="docRId2" o:title=""/>
                 </v:rect>
@@ -1308,8 +1308,8 @@
               </w:rPr>
             </w:pPr>
             <w:r>
-              <w:object w:dxaOrig="8640" w:dyaOrig="5580">
-                <v:rect xmlns:o="urn:schemas-microsoft-com:office:office" xmlns:v="urn:schemas-microsoft-com:vml" id="rectole0000000001" style="width:432.000000pt;height:279.000000pt" o:preferrelative="t" o:ole="">
+              <w:object w:dxaOrig="8848" w:dyaOrig="5709">
+                <v:rect xmlns:o="urn:schemas-microsoft-com:office:office" xmlns:v="urn:schemas-microsoft-com:vml" id="rectole0000000001" style="width:442.400000pt;height:285.450000pt" o:preferrelative="t" o:ole="">
                   <o:lock v:ext="edit"/>
                   <v:imagedata xmlns:r="http://schemas.openxmlformats.org/officeDocument/2006/relationships" r:id="docRId4" o:title=""/>
                 </v:rect>
@@ -1687,7 +1687,85 @@
                 <w:sz w:val="22"/>
                 <w:shd w:fill="auto" w:val="clear"/>
               </w:rPr>
-              <w:t xml:space="preserve">useful, Aesthetics, praivacy and functional </w:t>
+              <w:t xml:space="preserve">useful</w:t>
+            </w:r>
+          </w:p>
+          <w:p>
+            <w:pPr>
+              <w:spacing w:before="0" w:after="0" w:line="240"/>
+              <w:ind w:right="0" w:left="0" w:firstLine="0"/>
+              <w:jc w:val="left"/>
+              <w:rPr>
+                <w:rFonts w:ascii="Calibri" w:hAnsi="Calibri" w:cs="Calibri" w:eastAsia="Calibri"/>
+                <w:color w:val="auto"/>
+                <w:spacing w:val="0"/>
+                <w:position w:val="0"/>
+                <w:sz w:val="22"/>
+                <w:shd w:fill="auto" w:val="clear"/>
+              </w:rPr>
+            </w:pPr>
+            <w:r>
+              <w:rPr>
+                <w:rFonts w:ascii="Calibri" w:hAnsi="Calibri" w:cs="Calibri" w:eastAsia="Calibri"/>
+                <w:color w:val="auto"/>
+                <w:spacing w:val="0"/>
+                <w:position w:val="0"/>
+                <w:sz w:val="22"/>
+                <w:shd w:fill="auto" w:val="clear"/>
+              </w:rPr>
+              <w:t xml:space="preserve">when it comes to my website i would want to prititoize the need for it to be useful to the users. the idea for my website is to make it useful by being able to hold infomation for the user</w:t>
+            </w:r>
+          </w:p>
+          <w:p>
+            <w:pPr>
+              <w:spacing w:before="0" w:after="0" w:line="240"/>
+              <w:ind w:right="0" w:left="0" w:firstLine="0"/>
+              <w:jc w:val="left"/>
+              <w:rPr>
+                <w:rFonts w:ascii="Calibri" w:hAnsi="Calibri" w:cs="Calibri" w:eastAsia="Calibri"/>
+                <w:color w:val="auto"/>
+                <w:spacing w:val="0"/>
+                <w:position w:val="0"/>
+                <w:sz w:val="22"/>
+                <w:shd w:fill="auto" w:val="clear"/>
+              </w:rPr>
+            </w:pPr>
+            <w:r>
+              <w:rPr>
+                <w:rFonts w:ascii="Calibri" w:hAnsi="Calibri" w:cs="Calibri" w:eastAsia="Calibri"/>
+                <w:color w:val="auto"/>
+                <w:spacing w:val="0"/>
+                <w:position w:val="0"/>
+                <w:sz w:val="22"/>
+                <w:shd w:fill="auto" w:val="clear"/>
+              </w:rPr>
+              <w:t xml:space="preserve">Aesthetics</w:t>
+            </w:r>
+          </w:p>
+          <w:p>
+            <w:pPr>
+              <w:spacing w:before="0" w:after="0" w:line="240"/>
+              <w:ind w:right="0" w:left="0" w:firstLine="0"/>
+              <w:jc w:val="left"/>
+              <w:rPr>
+                <w:rFonts w:ascii="Calibri" w:hAnsi="Calibri" w:cs="Calibri" w:eastAsia="Calibri"/>
+                <w:color w:val="auto"/>
+                <w:spacing w:val="0"/>
+                <w:position w:val="0"/>
+                <w:sz w:val="22"/>
+                <w:shd w:fill="auto" w:val="clear"/>
+              </w:rPr>
+            </w:pPr>
+            <w:r>
+              <w:rPr>
+                <w:rFonts w:ascii="Calibri" w:hAnsi="Calibri" w:cs="Calibri" w:eastAsia="Calibri"/>
+                <w:color w:val="auto"/>
+                <w:spacing w:val="0"/>
+                <w:position w:val="0"/>
+                <w:sz w:val="22"/>
+                <w:shd w:fill="auto" w:val="clear"/>
+              </w:rPr>
+              <w:t xml:space="preserve">privacy and functional </w:t>
             </w:r>
           </w:p>
           <w:p>
@@ -2623,8 +2701,8 @@
               </w:rPr>
             </w:pPr>
             <w:r>
-              <w:object w:dxaOrig="5025" w:dyaOrig="1574">
-                <v:rect xmlns:o="urn:schemas-microsoft-com:office:office" xmlns:v="urn:schemas-microsoft-com:vml" id="rectole0000000002" style="width:251.250000pt;height:78.700000pt" o:preferrelative="t" o:ole="">
+              <w:object w:dxaOrig="5142" w:dyaOrig="1619">
+                <v:rect xmlns:o="urn:schemas-microsoft-com:office:office" xmlns:v="urn:schemas-microsoft-com:vml" id="rectole0000000002" style="width:257.100000pt;height:80.950000pt" o:preferrelative="t" o:ole="">
                   <o:lock v:ext="edit"/>
                   <v:imagedata xmlns:r="http://schemas.openxmlformats.org/officeDocument/2006/relationships" r:id="docRId6" o:title=""/>
                 </v:rect>
@@ -2643,7 +2721,6 @@
                 <w:spacing w:val="0"/>
                 <w:position w:val="0"/>
                 <w:sz w:val="22"/>
-                <w:shd w:fill="auto" w:val="clear"/>
               </w:rPr>
             </w:pPr>
           </w:p>
@@ -2675,7 +2752,6 @@
                 <w:spacing w:val="0"/>
                 <w:position w:val="0"/>
                 <w:sz w:val="22"/>
-                <w:shd w:fill="auto" w:val="clear"/>
               </w:rPr>
             </w:pPr>
             <w:r>
@@ -2744,7 +2820,6 @@
                 <w:spacing w:val="0"/>
                 <w:position w:val="0"/>
                 <w:sz w:val="22"/>
-                <w:shd w:fill="auto" w:val="clear"/>
               </w:rPr>
             </w:pPr>
             <w:r>
@@ -2813,7 +2888,6 @@
                 <w:spacing w:val="0"/>
                 <w:position w:val="0"/>
                 <w:sz w:val="22"/>
-                <w:shd w:fill="auto" w:val="clear"/>
               </w:rPr>
             </w:pPr>
             <w:r>
@@ -2892,8 +2966,8 @@
               </w:rPr>
             </w:pPr>
             <w:r>
-              <w:object w:dxaOrig="5325" w:dyaOrig="299">
-                <v:rect xmlns:o="urn:schemas-microsoft-com:office:office" xmlns:v="urn:schemas-microsoft-com:vml" id="rectole0000000003" style="width:266.250000pt;height:14.950000pt" o:preferrelative="t" o:ole="">
+              <w:object w:dxaOrig="5446" w:dyaOrig="303">
+                <v:rect xmlns:o="urn:schemas-microsoft-com:office:office" xmlns:v="urn:schemas-microsoft-com:vml" id="rectole0000000003" style="width:272.300000pt;height:15.150000pt" o:preferrelative="t" o:ole="">
                   <o:lock v:ext="edit"/>
                   <v:imagedata xmlns:r="http://schemas.openxmlformats.org/officeDocument/2006/relationships" r:id="docRId8" o:title=""/>
                 </v:rect>
@@ -2912,7 +2986,6 @@
                 <w:spacing w:val="0"/>
                 <w:position w:val="0"/>
                 <w:sz w:val="22"/>
-                <w:shd w:fill="auto" w:val="clear"/>
               </w:rPr>
             </w:pPr>
           </w:p>
@@ -2944,7 +3017,6 @@
                 <w:spacing w:val="0"/>
                 <w:position w:val="0"/>
                 <w:sz w:val="22"/>
-                <w:shd w:fill="auto" w:val="clear"/>
               </w:rPr>
             </w:pPr>
             <w:r>
@@ -2987,7 +3059,6 @@
                 <w:spacing w:val="0"/>
                 <w:position w:val="0"/>
                 <w:sz w:val="22"/>
-                <w:shd w:fill="auto" w:val="clear"/>
               </w:rPr>
             </w:pPr>
             <w:r>
@@ -3056,7 +3127,6 @@
                 <w:spacing w:val="0"/>
                 <w:position w:val="0"/>
                 <w:sz w:val="22"/>
-                <w:shd w:fill="auto" w:val="clear"/>
               </w:rPr>
             </w:pPr>
             <w:r>
@@ -3135,8 +3205,8 @@
               </w:rPr>
             </w:pPr>
             <w:r>
-              <w:object w:dxaOrig="3509" w:dyaOrig="329">
-                <v:rect xmlns:o="urn:schemas-microsoft-com:office:office" xmlns:v="urn:schemas-microsoft-com:vml" id="rectole0000000004" style="width:175.450000pt;height:16.450000pt" o:preferrelative="t" o:ole="">
+              <w:object w:dxaOrig="3583" w:dyaOrig="323">
+                <v:rect xmlns:o="urn:schemas-microsoft-com:office:office" xmlns:v="urn:schemas-microsoft-com:vml" id="rectole0000000004" style="width:179.150000pt;height:16.150000pt" o:preferrelative="t" o:ole="">
                   <o:lock v:ext="edit"/>
                   <v:imagedata xmlns:r="http://schemas.openxmlformats.org/officeDocument/2006/relationships" r:id="docRId10" o:title=""/>
                 </v:rect>
@@ -3174,8 +3244,8 @@
               </w:rPr>
             </w:pPr>
             <w:r>
-              <w:object w:dxaOrig="6029" w:dyaOrig="734">
-                <v:rect xmlns:o="urn:schemas-microsoft-com:office:office" xmlns:v="urn:schemas-microsoft-com:vml" id="rectole0000000005" style="width:301.450000pt;height:36.700000pt" o:preferrelative="t" o:ole="">
+              <w:object w:dxaOrig="6175" w:dyaOrig="748">
+                <v:rect xmlns:o="urn:schemas-microsoft-com:office:office" xmlns:v="urn:schemas-microsoft-com:vml" id="rectole0000000005" style="width:308.750000pt;height:37.400000pt" o:preferrelative="t" o:ole="">
                   <o:lock v:ext="edit"/>
                   <v:imagedata xmlns:r="http://schemas.openxmlformats.org/officeDocument/2006/relationships" r:id="docRId12" o:title=""/>
                 </v:rect>
@@ -3194,7 +3264,6 @@
                 <w:spacing w:val="0"/>
                 <w:position w:val="0"/>
                 <w:sz w:val="22"/>
-                <w:shd w:fill="auto" w:val="clear"/>
               </w:rPr>
             </w:pPr>
           </w:p>
@@ -3226,7 +3295,6 @@
                 <w:spacing w:val="0"/>
                 <w:position w:val="0"/>
                 <w:sz w:val="22"/>
-                <w:shd w:fill="auto" w:val="clear"/>
               </w:rPr>
             </w:pPr>
             <w:r>
@@ -3295,7 +3363,6 @@
                 <w:spacing w:val="0"/>
                 <w:position w:val="0"/>
                 <w:sz w:val="22"/>
-                <w:shd w:fill="auto" w:val="clear"/>
               </w:rPr>
             </w:pPr>
             <w:r>
@@ -3390,7 +3457,6 @@
                 <w:spacing w:val="0"/>
                 <w:position w:val="0"/>
                 <w:sz w:val="22"/>
-                <w:shd w:fill="auto" w:val="clear"/>
               </w:rPr>
             </w:pPr>
           </w:p>
@@ -4426,6 +4492,30 @@
                 <w:shd w:fill="auto" w:val="clear"/>
               </w:rPr>
             </w:pPr>
+            <w:r>
+              <w:object w:dxaOrig="8747" w:dyaOrig="5163">
+                <v:rect xmlns:o="urn:schemas-microsoft-com:office:office" xmlns:v="urn:schemas-microsoft-com:vml" id="rectole0000000006" style="width:437.350000pt;height:258.150000pt" o:preferrelative="t" o:ole="">
+                  <o:lock v:ext="edit"/>
+                  <v:imagedata xmlns:r="http://schemas.openxmlformats.org/officeDocument/2006/relationships" r:id="docRId14" o:title=""/>
+                </v:rect>
+                <o:OLEObject xmlns:r="http://schemas.openxmlformats.org/officeDocument/2006/relationships" xmlns:o="urn:schemas-microsoft-com:office:office" Type="Embed" ProgID="StaticMetafile" DrawAspect="Content" ObjectID="0000000006" ShapeID="rectole0000000006" r:id="docRId13"/>
+              </w:object>
+            </w:r>
+          </w:p>
+          <w:p>
+            <w:pPr>
+              <w:spacing w:before="0" w:after="0" w:line="240"/>
+              <w:ind w:right="0" w:left="0" w:firstLine="0"/>
+              <w:jc w:val="left"/>
+              <w:rPr>
+                <w:rFonts w:ascii="Calibri" w:hAnsi="Calibri" w:cs="Calibri" w:eastAsia="Calibri"/>
+                <w:color w:val="auto"/>
+                <w:spacing w:val="0"/>
+                <w:position w:val="0"/>
+                <w:sz w:val="22"/>
+                <w:shd w:fill="auto" w:val="clear"/>
+              </w:rPr>
+            </w:pPr>
           </w:p>
           <w:p>
             <w:pPr>
@@ -4887,6 +4977,30 @@
                 <w:shd w:fill="auto" w:val="clear"/>
               </w:rPr>
             </w:pPr>
+          </w:p>
+          <w:p>
+            <w:pPr>
+              <w:spacing w:before="0" w:after="0" w:line="240"/>
+              <w:ind w:right="0" w:left="0" w:firstLine="0"/>
+              <w:jc w:val="left"/>
+              <w:rPr>
+                <w:rFonts w:ascii="Arial" w:hAnsi="Arial" w:cs="Arial" w:eastAsia="Arial"/>
+                <w:color w:val="auto"/>
+                <w:spacing w:val="0"/>
+                <w:position w:val="0"/>
+                <w:sz w:val="22"/>
+                <w:shd w:fill="auto" w:val="clear"/>
+              </w:rPr>
+            </w:pPr>
+            <w:r>
+              <w:object w:dxaOrig="8747" w:dyaOrig="5426">
+                <v:rect xmlns:o="urn:schemas-microsoft-com:office:office" xmlns:v="urn:schemas-microsoft-com:vml" id="rectole0000000007" style="width:437.350000pt;height:271.300000pt" o:preferrelative="t" o:ole="">
+                  <o:lock v:ext="edit"/>
+                  <v:imagedata xmlns:r="http://schemas.openxmlformats.org/officeDocument/2006/relationships" r:id="docRId16" o:title=""/>
+                </v:rect>
+                <o:OLEObject xmlns:r="http://schemas.openxmlformats.org/officeDocument/2006/relationships" xmlns:o="urn:schemas-microsoft-com:office:office" Type="Embed" ProgID="StaticMetafile" DrawAspect="Content" ObjectID="0000000007" ShapeID="rectole0000000007" r:id="docRId15"/>
+              </w:object>
+            </w:r>
           </w:p>
           <w:p>
             <w:pPr>
@@ -7047,6 +7161,15 @@
                 <w:shd w:fill="auto" w:val="clear"/>
               </w:rPr>
             </w:pPr>
+            <w:r>
+              <w:object w:dxaOrig="8747" w:dyaOrig="5163">
+                <v:rect xmlns:o="urn:schemas-microsoft-com:office:office" xmlns:v="urn:schemas-microsoft-com:vml" id="rectole0000000008" style="width:437.350000pt;height:258.150000pt" o:preferrelative="t" o:ole="">
+                  <o:lock v:ext="edit"/>
+                  <v:imagedata xmlns:r="http://schemas.openxmlformats.org/officeDocument/2006/relationships" r:id="docRId18" o:title=""/>
+                </v:rect>
+                <o:OLEObject xmlns:r="http://schemas.openxmlformats.org/officeDocument/2006/relationships" xmlns:o="urn:schemas-microsoft-com:office:office" Type="Embed" ProgID="StaticMetafile" DrawAspect="Content" ObjectID="0000000008" ShapeID="rectole0000000008" r:id="docRId17"/>
+              </w:object>
+            </w:r>
           </w:p>
           <w:p>
             <w:pPr>
@@ -7448,6 +7571,60 @@
                 <w:shd w:fill="auto" w:val="clear"/>
               </w:rPr>
             </w:pPr>
+          </w:p>
+          <w:p>
+            <w:pPr>
+              <w:spacing w:before="0" w:after="0" w:line="240"/>
+              <w:ind w:right="0" w:left="0" w:firstLine="0"/>
+              <w:jc w:val="left"/>
+              <w:rPr>
+                <w:rFonts w:ascii="Arial" w:hAnsi="Arial" w:cs="Arial" w:eastAsia="Arial"/>
+                <w:color w:val="auto"/>
+                <w:spacing w:val="0"/>
+                <w:position w:val="0"/>
+                <w:sz w:val="22"/>
+                <w:shd w:fill="auto" w:val="clear"/>
+              </w:rPr>
+            </w:pPr>
+          </w:p>
+          <w:p>
+            <w:pPr>
+              <w:spacing w:before="0" w:after="0" w:line="240"/>
+              <w:ind w:right="0" w:left="0" w:firstLine="0"/>
+              <w:jc w:val="left"/>
+              <w:rPr>
+                <w:rFonts w:ascii="Arial" w:hAnsi="Arial" w:cs="Arial" w:eastAsia="Arial"/>
+                <w:color w:val="auto"/>
+                <w:spacing w:val="0"/>
+                <w:position w:val="0"/>
+                <w:sz w:val="22"/>
+                <w:shd w:fill="auto" w:val="clear"/>
+              </w:rPr>
+            </w:pPr>
+          </w:p>
+          <w:p>
+            <w:pPr>
+              <w:spacing w:before="0" w:after="0" w:line="240"/>
+              <w:ind w:right="0" w:left="0" w:firstLine="0"/>
+              <w:jc w:val="left"/>
+              <w:rPr>
+                <w:rFonts w:ascii="Arial" w:hAnsi="Arial" w:cs="Arial" w:eastAsia="Arial"/>
+                <w:color w:val="auto"/>
+                <w:spacing w:val="0"/>
+                <w:position w:val="0"/>
+                <w:sz w:val="22"/>
+                <w:shd w:fill="auto" w:val="clear"/>
+              </w:rPr>
+            </w:pPr>
+            <w:r>
+              <w:object w:dxaOrig="8747" w:dyaOrig="5426">
+                <v:rect xmlns:o="urn:schemas-microsoft-com:office:office" xmlns:v="urn:schemas-microsoft-com:vml" id="rectole0000000009" style="width:437.350000pt;height:271.300000pt" o:preferrelative="t" o:ole="">
+                  <o:lock v:ext="edit"/>
+                  <v:imagedata xmlns:r="http://schemas.openxmlformats.org/officeDocument/2006/relationships" r:id="docRId20" o:title=""/>
+                </v:rect>
+                <o:OLEObject xmlns:r="http://schemas.openxmlformats.org/officeDocument/2006/relationships" xmlns:o="urn:schemas-microsoft-com:office:office" Type="Embed" ProgID="StaticDib" DrawAspect="Content" ObjectID="0000000009" ShapeID="rectole0000000009" r:id="docRId19"/>
+              </w:object>
+            </w:r>
           </w:p>
           <w:p>
             <w:pPr>
@@ -9843,7 +10020,7 @@
         </w:rPr>
         <w:tab/>
       </w:r>
-      <w:hyperlink xmlns:r="http://schemas.openxmlformats.org/officeDocument/2006/relationships" r:id="docRId13">
+      <w:hyperlink xmlns:r="http://schemas.openxmlformats.org/officeDocument/2006/relationships" r:id="docRId21">
         <w:r>
           <w:rPr>
             <w:rFonts w:ascii="Arial" w:hAnsi="Arial" w:cs="Arial" w:eastAsia="Arial"/>
@@ -11578,7 +11755,7 @@
         </w:rPr>
         <w:tab/>
       </w:r>
-      <w:hyperlink xmlns:r="http://schemas.openxmlformats.org/officeDocument/2006/relationships" r:id="docRId14">
+      <w:hyperlink xmlns:r="http://schemas.openxmlformats.org/officeDocument/2006/relationships" r:id="docRId22">
         <w:r>
           <w:rPr>
             <w:rFonts w:ascii="Arial" w:hAnsi="Arial" w:cs="Arial" w:eastAsia="Arial"/>
@@ -13098,7 +13275,7 @@
         </w:rPr>
         <w:tab/>
       </w:r>
-      <w:hyperlink xmlns:r="http://schemas.openxmlformats.org/officeDocument/2006/relationships" r:id="docRId15">
+      <w:hyperlink xmlns:r="http://schemas.openxmlformats.org/officeDocument/2006/relationships" r:id="docRId23">
         <w:r>
           <w:rPr>
             <w:rFonts w:ascii="Arial" w:hAnsi="Arial" w:cs="Arial" w:eastAsia="Arial"/>

</xml_diff>